<commit_message>
Add twenty practical document workflows and improve report spacing
</commit_message>
<xml_diff>
--- a/Website/static/downloads/showcase/pswriteoffice/patch-compliance-report.docx
+++ b/Website/static/downloads/showcase/pswriteoffice/patch-compliance-report.docx
@@ -3,7 +3,10 @@
 <w:document xmlns:a="http://schemas.openxmlformats.org/drawingml/2006/main" xmlns:c="http://schemas.openxmlformats.org/drawingml/2006/chart" xmlns:wpc="http://schemas.microsoft.com/office/word/2010/wordprocessingCanvas" xmlns:cx="http://schemas.microsoft.com/office/drawing/2014/chartex" xmlns:cx1="http://schemas.microsoft.com/office/drawing/2015/9/8/chartex" xmlns:cx2="http://schemas.microsoft.com/office/drawing/2015/10/21/chartex" xmlns:cx3="http://schemas.microsoft.com/office/drawing/2016/5/9/chartex" xmlns:cx4="http://schemas.microsoft.com/office/drawing/2016/5/10/chartex" xmlns:cx5="http://schemas.microsoft.com/office/drawing/2016/5/11/chartex" xmlns:cx6="http://schemas.microsoft.com/office/drawing/2016/5/12/chartex" xmlns:cx7="http://schemas.microsoft.com/office/drawing/2016/5/13/chartex" xmlns:cx8="http://schemas.microsoft.com/office/drawing/2016/5/14/chartex" xmlns:mc="http://schemas.openxmlformats.org/markup-compatibility/2006" xmlns:aink="http://schemas.microsoft.com/office/drawing/2016/ink" xmlns:am3d="http://schemas.microsoft.com/office/drawing/2017/model3d" xmlns:o="urn:schemas-microsoft-com:office:office" xmlns:oel="http://schemas.microsoft.com/office/2019/extlst" xmlns:r="http://schemas.openxmlformats.org/officeDocument/2006/relationships" xmlns:m="http://schemas.openxmlformats.org/officeDocument/2006/math" xmlns:v="urn:schemas-microsoft-com:vml" xmlns:wp14="http://schemas.microsoft.com/office/word/2010/wordprocessingDrawing" xmlns:wp="http://schemas.openxmlformats.org/drawingml/2006/wordprocessingDrawing" xmlns:w10="urn:schemas-microsoft-com:office:word" xmlns:w="http://schemas.openxmlformats.org/wordprocessingml/2006/main" xmlns:w14="http://schemas.microsoft.com/office/word/2010/wordml" xmlns:w15="http://schemas.microsoft.com/office/word/2012/wordml" xmlns:w16cex="http://schemas.microsoft.com/office/word/2018/wordml/cex" xmlns:w16cid="http://schemas.microsoft.com/office/word/2016/wordml/cid" xmlns:w16="http://schemas.microsoft.com/office/word/2018/wordml" xmlns:w16sdtdh="http://schemas.microsoft.com/office/word/2020/wordml/sdtdatahash" xmlns:w16se="http://schemas.microsoft.com/office/word/2015/wordml/symex" xmlns:wpg="http://schemas.microsoft.com/office/word/2010/wordprocessingGroup" xmlns:wpi="http://schemas.microsoft.com/office/word/2010/wordprocessingInk" xmlns:wne="http://schemas.microsoft.com/office/word/2006/wordml" xmlns:wps="http://schemas.microsoft.com/office/word/2010/wordprocessingShape" mc:Ignorable="w14 w15 w16se w16cid w16 w16cex w16sdtdh wp14">
   <w:body>
     <w:p>
-      <w:pPr/>
+      <w:pPr>
+        <w:keepNext/>
+        <w:spacing w:after="280"/>
+      </w:pPr>
       <w:r>
         <w:rPr>
           <w:b/>
@@ -35,29 +38,44 @@
     <w:p>
       <w:pPr>
         <w:pStyle w:val="Heading1"/>
+        <w:keepNext/>
+        <w:spacing w:before="320" w:after="160"/>
       </w:pPr>
       <w:r>
+        <w:rPr>
+          <w:b/>
+          <w:bCs/>
+          <w:color w:val="17365D"/>
+          <w:sz w:val="30"/>
+        </w:rPr>
         <w:t xml:space="preserve">Compliance by site</w:t>
       </w:r>
     </w:p>
     <w:tbl>
       <w:tblPr>
         <w:tblStyle w:val="GridTable4-Accent1"/>
-        <w:tblW w:w="0" w:type="auto"/>
+        <w:tblW w:w="5000" w:type="pct"/>
+        <w:tblLayout w:type="fixed"/>
         <w:tblLook w:val="04A0"/>
       </w:tblPr>
       <w:tblGrid>
-        <w:gridCol w:w="2400"/>
-        <w:gridCol w:w="2400"/>
-        <w:gridCol w:w="2400"/>
-        <w:gridCol w:w="2400"/>
-        <w:gridCol w:w="2400"/>
-        <w:gridCol w:w="2400"/>
+        <w:gridCol w:w="1559"/>
+        <w:gridCol w:w="1559"/>
+        <w:gridCol w:w="1559"/>
+        <w:gridCol w:w="1559"/>
+        <w:gridCol w:w="1559"/>
+        <w:gridCol w:w="1565"/>
       </w:tblGrid>
       <w:tr>
         <w:tc>
           <w:tcPr>
-            <w:tcW w:w="2400" w:type="dxa"/>
+            <w:tcW w:w="833" w:type="pct"/>
+            <w:tcMar>
+              <w:top w:w="68" w:type="dxa"/>
+              <w:left w:w="91" w:type="dxa"/>
+              <w:bottom w:w="68" w:type="dxa"/>
+              <w:right w:w="91" w:type="dxa"/>
+            </w:tcMar>
           </w:tcPr>
           <w:p>
             <w:pPr/>
@@ -68,7 +86,13 @@
         </w:tc>
         <w:tc>
           <w:tcPr>
-            <w:tcW w:w="2400" w:type="dxa"/>
+            <w:tcW w:w="833" w:type="pct"/>
+            <w:tcMar>
+              <w:top w:w="68" w:type="dxa"/>
+              <w:left w:w="91" w:type="dxa"/>
+              <w:bottom w:w="68" w:type="dxa"/>
+              <w:right w:w="91" w:type="dxa"/>
+            </w:tcMar>
           </w:tcPr>
           <w:p>
             <w:pPr/>
@@ -79,7 +103,13 @@
         </w:tc>
         <w:tc>
           <w:tcPr>
-            <w:tcW w:w="2400" w:type="dxa"/>
+            <w:tcW w:w="833" w:type="pct"/>
+            <w:tcMar>
+              <w:top w:w="68" w:type="dxa"/>
+              <w:left w:w="91" w:type="dxa"/>
+              <w:bottom w:w="68" w:type="dxa"/>
+              <w:right w:w="91" w:type="dxa"/>
+            </w:tcMar>
           </w:tcPr>
           <w:p>
             <w:pPr/>
@@ -90,7 +120,13 @@
         </w:tc>
         <w:tc>
           <w:tcPr>
-            <w:tcW w:w="2400" w:type="dxa"/>
+            <w:tcW w:w="833" w:type="pct"/>
+            <w:tcMar>
+              <w:top w:w="68" w:type="dxa"/>
+              <w:left w:w="91" w:type="dxa"/>
+              <w:bottom w:w="68" w:type="dxa"/>
+              <w:right w:w="91" w:type="dxa"/>
+            </w:tcMar>
           </w:tcPr>
           <w:p>
             <w:pPr/>
@@ -101,7 +137,13 @@
         </w:tc>
         <w:tc>
           <w:tcPr>
-            <w:tcW w:w="2400" w:type="dxa"/>
+            <w:tcW w:w="833" w:type="pct"/>
+            <w:tcMar>
+              <w:top w:w="68" w:type="dxa"/>
+              <w:left w:w="91" w:type="dxa"/>
+              <w:bottom w:w="68" w:type="dxa"/>
+              <w:right w:w="91" w:type="dxa"/>
+            </w:tcMar>
           </w:tcPr>
           <w:p>
             <w:pPr/>
@@ -112,7 +154,13 @@
         </w:tc>
         <w:tc>
           <w:tcPr>
-            <w:tcW w:w="2400" w:type="dxa"/>
+            <w:tcW w:w="835" w:type="pct"/>
+            <w:tcMar>
+              <w:top w:w="68" w:type="dxa"/>
+              <w:left w:w="91" w:type="dxa"/>
+              <w:bottom w:w="68" w:type="dxa"/>
+              <w:right w:w="91" w:type="dxa"/>
+            </w:tcMar>
           </w:tcPr>
           <w:p>
             <w:pPr/>
@@ -125,7 +173,13 @@
       <w:tr>
         <w:tc>
           <w:tcPr>
-            <w:tcW w:w="2400" w:type="dxa"/>
+            <w:tcW w:w="833" w:type="pct"/>
+            <w:tcMar>
+              <w:top w:w="68" w:type="dxa"/>
+              <w:left w:w="91" w:type="dxa"/>
+              <w:bottom w:w="68" w:type="dxa"/>
+              <w:right w:w="91" w:type="dxa"/>
+            </w:tcMar>
           </w:tcPr>
           <w:p>
             <w:pPr/>
@@ -136,7 +190,13 @@
         </w:tc>
         <w:tc>
           <w:tcPr>
-            <w:tcW w:w="2400" w:type="dxa"/>
+            <w:tcW w:w="833" w:type="pct"/>
+            <w:tcMar>
+              <w:top w:w="68" w:type="dxa"/>
+              <w:left w:w="91" w:type="dxa"/>
+              <w:bottom w:w="68" w:type="dxa"/>
+              <w:right w:w="91" w:type="dxa"/>
+            </w:tcMar>
           </w:tcPr>
           <w:p>
             <w:pPr/>
@@ -147,7 +207,13 @@
         </w:tc>
         <w:tc>
           <w:tcPr>
-            <w:tcW w:w="2400" w:type="dxa"/>
+            <w:tcW w:w="833" w:type="pct"/>
+            <w:tcMar>
+              <w:top w:w="68" w:type="dxa"/>
+              <w:left w:w="91" w:type="dxa"/>
+              <w:bottom w:w="68" w:type="dxa"/>
+              <w:right w:w="91" w:type="dxa"/>
+            </w:tcMar>
           </w:tcPr>
           <w:p>
             <w:pPr/>
@@ -158,7 +224,13 @@
         </w:tc>
         <w:tc>
           <w:tcPr>
-            <w:tcW w:w="2400" w:type="dxa"/>
+            <w:tcW w:w="833" w:type="pct"/>
+            <w:tcMar>
+              <w:top w:w="68" w:type="dxa"/>
+              <w:left w:w="91" w:type="dxa"/>
+              <w:bottom w:w="68" w:type="dxa"/>
+              <w:right w:w="91" w:type="dxa"/>
+            </w:tcMar>
           </w:tcPr>
           <w:p>
             <w:pPr/>
@@ -169,7 +241,13 @@
         </w:tc>
         <w:tc>
           <w:tcPr>
-            <w:tcW w:w="2400" w:type="dxa"/>
+            <w:tcW w:w="833" w:type="pct"/>
+            <w:tcMar>
+              <w:top w:w="68" w:type="dxa"/>
+              <w:left w:w="91" w:type="dxa"/>
+              <w:bottom w:w="68" w:type="dxa"/>
+              <w:right w:w="91" w:type="dxa"/>
+            </w:tcMar>
           </w:tcPr>
           <w:p>
             <w:pPr/>
@@ -180,7 +258,13 @@
         </w:tc>
         <w:tc>
           <w:tcPr>
-            <w:tcW w:w="2400" w:type="dxa"/>
+            <w:tcW w:w="835" w:type="pct"/>
+            <w:tcMar>
+              <w:top w:w="68" w:type="dxa"/>
+              <w:left w:w="91" w:type="dxa"/>
+              <w:bottom w:w="68" w:type="dxa"/>
+              <w:right w:w="91" w:type="dxa"/>
+            </w:tcMar>
           </w:tcPr>
           <w:p>
             <w:pPr/>
@@ -193,8 +277,14 @@
       <w:tr>
         <w:tc>
           <w:tcPr>
-            <w:tcW w:w="2400" w:type="dxa"/>
+            <w:tcW w:w="833" w:type="pct"/>
             <w:shd w:val="clear" w:fill="FFF4D6"/>
+            <w:tcMar>
+              <w:top w:w="68" w:type="dxa"/>
+              <w:left w:w="91" w:type="dxa"/>
+              <w:bottom w:w="68" w:type="dxa"/>
+              <w:right w:w="91" w:type="dxa"/>
+            </w:tcMar>
           </w:tcPr>
           <w:p>
             <w:pPr/>
@@ -205,8 +295,14 @@
         </w:tc>
         <w:tc>
           <w:tcPr>
-            <w:tcW w:w="2400" w:type="dxa"/>
+            <w:tcW w:w="833" w:type="pct"/>
             <w:shd w:val="clear" w:fill="FFF4D6"/>
+            <w:tcMar>
+              <w:top w:w="68" w:type="dxa"/>
+              <w:left w:w="91" w:type="dxa"/>
+              <w:bottom w:w="68" w:type="dxa"/>
+              <w:right w:w="91" w:type="dxa"/>
+            </w:tcMar>
           </w:tcPr>
           <w:p>
             <w:pPr/>
@@ -217,8 +313,14 @@
         </w:tc>
         <w:tc>
           <w:tcPr>
-            <w:tcW w:w="2400" w:type="dxa"/>
+            <w:tcW w:w="833" w:type="pct"/>
             <w:shd w:val="clear" w:fill="FFF4D6"/>
+            <w:tcMar>
+              <w:top w:w="68" w:type="dxa"/>
+              <w:left w:w="91" w:type="dxa"/>
+              <w:bottom w:w="68" w:type="dxa"/>
+              <w:right w:w="91" w:type="dxa"/>
+            </w:tcMar>
           </w:tcPr>
           <w:p>
             <w:pPr/>
@@ -229,8 +331,14 @@
         </w:tc>
         <w:tc>
           <w:tcPr>
-            <w:tcW w:w="2400" w:type="dxa"/>
+            <w:tcW w:w="833" w:type="pct"/>
             <w:shd w:val="clear" w:fill="FFF4D6"/>
+            <w:tcMar>
+              <w:top w:w="68" w:type="dxa"/>
+              <w:left w:w="91" w:type="dxa"/>
+              <w:bottom w:w="68" w:type="dxa"/>
+              <w:right w:w="91" w:type="dxa"/>
+            </w:tcMar>
           </w:tcPr>
           <w:p>
             <w:pPr/>
@@ -241,8 +349,14 @@
         </w:tc>
         <w:tc>
           <w:tcPr>
-            <w:tcW w:w="2400" w:type="dxa"/>
+            <w:tcW w:w="833" w:type="pct"/>
             <w:shd w:val="clear" w:fill="FFF4D6"/>
+            <w:tcMar>
+              <w:top w:w="68" w:type="dxa"/>
+              <w:left w:w="91" w:type="dxa"/>
+              <w:bottom w:w="68" w:type="dxa"/>
+              <w:right w:w="91" w:type="dxa"/>
+            </w:tcMar>
           </w:tcPr>
           <w:p>
             <w:pPr/>
@@ -253,8 +367,14 @@
         </w:tc>
         <w:tc>
           <w:tcPr>
-            <w:tcW w:w="2400" w:type="dxa"/>
+            <w:tcW w:w="835" w:type="pct"/>
             <w:shd w:val="clear" w:fill="FFF4D6"/>
+            <w:tcMar>
+              <w:top w:w="68" w:type="dxa"/>
+              <w:left w:w="91" w:type="dxa"/>
+              <w:bottom w:w="68" w:type="dxa"/>
+              <w:right w:w="91" w:type="dxa"/>
+            </w:tcMar>
           </w:tcPr>
           <w:p>
             <w:pPr/>
@@ -267,7 +387,13 @@
       <w:tr>
         <w:tc>
           <w:tcPr>
-            <w:tcW w:w="2400" w:type="dxa"/>
+            <w:tcW w:w="833" w:type="pct"/>
+            <w:tcMar>
+              <w:top w:w="68" w:type="dxa"/>
+              <w:left w:w="91" w:type="dxa"/>
+              <w:bottom w:w="68" w:type="dxa"/>
+              <w:right w:w="91" w:type="dxa"/>
+            </w:tcMar>
           </w:tcPr>
           <w:p>
             <w:pPr/>
@@ -278,7 +404,13 @@
         </w:tc>
         <w:tc>
           <w:tcPr>
-            <w:tcW w:w="2400" w:type="dxa"/>
+            <w:tcW w:w="833" w:type="pct"/>
+            <w:tcMar>
+              <w:top w:w="68" w:type="dxa"/>
+              <w:left w:w="91" w:type="dxa"/>
+              <w:bottom w:w="68" w:type="dxa"/>
+              <w:right w:w="91" w:type="dxa"/>
+            </w:tcMar>
           </w:tcPr>
           <w:p>
             <w:pPr/>
@@ -289,7 +421,13 @@
         </w:tc>
         <w:tc>
           <w:tcPr>
-            <w:tcW w:w="2400" w:type="dxa"/>
+            <w:tcW w:w="833" w:type="pct"/>
+            <w:tcMar>
+              <w:top w:w="68" w:type="dxa"/>
+              <w:left w:w="91" w:type="dxa"/>
+              <w:bottom w:w="68" w:type="dxa"/>
+              <w:right w:w="91" w:type="dxa"/>
+            </w:tcMar>
           </w:tcPr>
           <w:p>
             <w:pPr/>
@@ -300,7 +438,13 @@
         </w:tc>
         <w:tc>
           <w:tcPr>
-            <w:tcW w:w="2400" w:type="dxa"/>
+            <w:tcW w:w="833" w:type="pct"/>
+            <w:tcMar>
+              <w:top w:w="68" w:type="dxa"/>
+              <w:left w:w="91" w:type="dxa"/>
+              <w:bottom w:w="68" w:type="dxa"/>
+              <w:right w:w="91" w:type="dxa"/>
+            </w:tcMar>
           </w:tcPr>
           <w:p>
             <w:pPr/>
@@ -311,7 +455,13 @@
         </w:tc>
         <w:tc>
           <w:tcPr>
-            <w:tcW w:w="2400" w:type="dxa"/>
+            <w:tcW w:w="833" w:type="pct"/>
+            <w:tcMar>
+              <w:top w:w="68" w:type="dxa"/>
+              <w:left w:w="91" w:type="dxa"/>
+              <w:bottom w:w="68" w:type="dxa"/>
+              <w:right w:w="91" w:type="dxa"/>
+            </w:tcMar>
           </w:tcPr>
           <w:p>
             <w:pPr/>
@@ -322,7 +472,13 @@
         </w:tc>
         <w:tc>
           <w:tcPr>
-            <w:tcW w:w="2400" w:type="dxa"/>
+            <w:tcW w:w="835" w:type="pct"/>
+            <w:tcMar>
+              <w:top w:w="68" w:type="dxa"/>
+              <w:left w:w="91" w:type="dxa"/>
+              <w:bottom w:w="68" w:type="dxa"/>
+              <w:right w:w="91" w:type="dxa"/>
+            </w:tcMar>
           </w:tcPr>
           <w:p>
             <w:pPr/>
@@ -335,7 +491,13 @@
       <w:tr>
         <w:tc>
           <w:tcPr>
-            <w:tcW w:w="2400" w:type="dxa"/>
+            <w:tcW w:w="833" w:type="pct"/>
+            <w:tcMar>
+              <w:top w:w="68" w:type="dxa"/>
+              <w:left w:w="91" w:type="dxa"/>
+              <w:bottom w:w="68" w:type="dxa"/>
+              <w:right w:w="91" w:type="dxa"/>
+            </w:tcMar>
           </w:tcPr>
           <w:p>
             <w:pPr/>
@@ -346,7 +508,13 @@
         </w:tc>
         <w:tc>
           <w:tcPr>
-            <w:tcW w:w="2400" w:type="dxa"/>
+            <w:tcW w:w="833" w:type="pct"/>
+            <w:tcMar>
+              <w:top w:w="68" w:type="dxa"/>
+              <w:left w:w="91" w:type="dxa"/>
+              <w:bottom w:w="68" w:type="dxa"/>
+              <w:right w:w="91" w:type="dxa"/>
+            </w:tcMar>
           </w:tcPr>
           <w:p>
             <w:pPr/>
@@ -357,7 +525,13 @@
         </w:tc>
         <w:tc>
           <w:tcPr>
-            <w:tcW w:w="2400" w:type="dxa"/>
+            <w:tcW w:w="833" w:type="pct"/>
+            <w:tcMar>
+              <w:top w:w="68" w:type="dxa"/>
+              <w:left w:w="91" w:type="dxa"/>
+              <w:bottom w:w="68" w:type="dxa"/>
+              <w:right w:w="91" w:type="dxa"/>
+            </w:tcMar>
           </w:tcPr>
           <w:p>
             <w:pPr/>
@@ -368,7 +542,13 @@
         </w:tc>
         <w:tc>
           <w:tcPr>
-            <w:tcW w:w="2400" w:type="dxa"/>
+            <w:tcW w:w="833" w:type="pct"/>
+            <w:tcMar>
+              <w:top w:w="68" w:type="dxa"/>
+              <w:left w:w="91" w:type="dxa"/>
+              <w:bottom w:w="68" w:type="dxa"/>
+              <w:right w:w="91" w:type="dxa"/>
+            </w:tcMar>
           </w:tcPr>
           <w:p>
             <w:pPr/>
@@ -379,7 +559,13 @@
         </w:tc>
         <w:tc>
           <w:tcPr>
-            <w:tcW w:w="2400" w:type="dxa"/>
+            <w:tcW w:w="833" w:type="pct"/>
+            <w:tcMar>
+              <w:top w:w="68" w:type="dxa"/>
+              <w:left w:w="91" w:type="dxa"/>
+              <w:bottom w:w="68" w:type="dxa"/>
+              <w:right w:w="91" w:type="dxa"/>
+            </w:tcMar>
           </w:tcPr>
           <w:p>
             <w:pPr/>
@@ -390,7 +576,13 @@
         </w:tc>
         <w:tc>
           <w:tcPr>
-            <w:tcW w:w="2400" w:type="dxa"/>
+            <w:tcW w:w="835" w:type="pct"/>
+            <w:tcMar>
+              <w:top w:w="68" w:type="dxa"/>
+              <w:left w:w="91" w:type="dxa"/>
+              <w:bottom w:w="68" w:type="dxa"/>
+              <w:right w:w="91" w:type="dxa"/>
+            </w:tcMar>
           </w:tcPr>
           <w:p>
             <w:pPr/>
@@ -403,8 +595,14 @@
       <w:tr>
         <w:tc>
           <w:tcPr>
-            <w:tcW w:w="2400" w:type="dxa"/>
+            <w:tcW w:w="833" w:type="pct"/>
             <w:shd w:val="clear" w:fill="FFF4D6"/>
+            <w:tcMar>
+              <w:top w:w="68" w:type="dxa"/>
+              <w:left w:w="91" w:type="dxa"/>
+              <w:bottom w:w="68" w:type="dxa"/>
+              <w:right w:w="91" w:type="dxa"/>
+            </w:tcMar>
           </w:tcPr>
           <w:p>
             <w:pPr/>
@@ -415,8 +613,14 @@
         </w:tc>
         <w:tc>
           <w:tcPr>
-            <w:tcW w:w="2400" w:type="dxa"/>
+            <w:tcW w:w="833" w:type="pct"/>
             <w:shd w:val="clear" w:fill="FFF4D6"/>
+            <w:tcMar>
+              <w:top w:w="68" w:type="dxa"/>
+              <w:left w:w="91" w:type="dxa"/>
+              <w:bottom w:w="68" w:type="dxa"/>
+              <w:right w:w="91" w:type="dxa"/>
+            </w:tcMar>
           </w:tcPr>
           <w:p>
             <w:pPr/>
@@ -427,8 +631,14 @@
         </w:tc>
         <w:tc>
           <w:tcPr>
-            <w:tcW w:w="2400" w:type="dxa"/>
+            <w:tcW w:w="833" w:type="pct"/>
             <w:shd w:val="clear" w:fill="FFF4D6"/>
+            <w:tcMar>
+              <w:top w:w="68" w:type="dxa"/>
+              <w:left w:w="91" w:type="dxa"/>
+              <w:bottom w:w="68" w:type="dxa"/>
+              <w:right w:w="91" w:type="dxa"/>
+            </w:tcMar>
           </w:tcPr>
           <w:p>
             <w:pPr/>
@@ -439,8 +649,14 @@
         </w:tc>
         <w:tc>
           <w:tcPr>
-            <w:tcW w:w="2400" w:type="dxa"/>
+            <w:tcW w:w="833" w:type="pct"/>
             <w:shd w:val="clear" w:fill="FFF4D6"/>
+            <w:tcMar>
+              <w:top w:w="68" w:type="dxa"/>
+              <w:left w:w="91" w:type="dxa"/>
+              <w:bottom w:w="68" w:type="dxa"/>
+              <w:right w:w="91" w:type="dxa"/>
+            </w:tcMar>
           </w:tcPr>
           <w:p>
             <w:pPr/>
@@ -451,8 +667,14 @@
         </w:tc>
         <w:tc>
           <w:tcPr>
-            <w:tcW w:w="2400" w:type="dxa"/>
+            <w:tcW w:w="833" w:type="pct"/>
             <w:shd w:val="clear" w:fill="FFF4D6"/>
+            <w:tcMar>
+              <w:top w:w="68" w:type="dxa"/>
+              <w:left w:w="91" w:type="dxa"/>
+              <w:bottom w:w="68" w:type="dxa"/>
+              <w:right w:w="91" w:type="dxa"/>
+            </w:tcMar>
           </w:tcPr>
           <w:p>
             <w:pPr/>
@@ -463,8 +685,14 @@
         </w:tc>
         <w:tc>
           <w:tcPr>
-            <w:tcW w:w="2400" w:type="dxa"/>
+            <w:tcW w:w="835" w:type="pct"/>
             <w:shd w:val="clear" w:fill="FFF4D6"/>
+            <w:tcMar>
+              <w:top w:w="68" w:type="dxa"/>
+              <w:left w:w="91" w:type="dxa"/>
+              <w:bottom w:w="68" w:type="dxa"/>
+              <w:right w:w="91" w:type="dxa"/>
+            </w:tcMar>
           </w:tcPr>
           <w:p>
             <w:pPr/>
@@ -476,19 +704,21 @@
       </w:tr>
     </w:tbl>
     <w:p>
-      <w:pPr/>
+      <w:pPr>
+        <w:spacing w:before="280" w:after="240"/>
+      </w:pPr>
     </w:p>
     <w:p>
       <w:pPr/>
       <w:r>
         <w:drawing>
           <wp:inline xmlns:wp="http://schemas.openxmlformats.org/drawingml/2006/wordprocessingDrawing">
-            <wp:extent cx="5353050" cy="3429000"/>
+            <wp:extent cx="5943600" cy="2476500"/>
             <wp:effectExtent l="0" t="0" r="19050" b="19050"/>
             <wp:docPr id="1" name="chart"/>
             <a:graphic xmlns:a="http://schemas.openxmlformats.org/drawingml/2006/main">
               <a:graphicData uri="http://schemas.openxmlformats.org/drawingml/2006/chart">
-                <c:chart xmlns:p6="http://schemas.openxmlformats.org/officeDocument/2006/relationships" xmlns:c="http://schemas.openxmlformats.org/drawingml/2006/chart" p6:id="R2710d3fa1d1e4933"/>
+                <c:chart xmlns:p6="http://schemas.openxmlformats.org/officeDocument/2006/relationships" xmlns:c="http://schemas.openxmlformats.org/drawingml/2006/chart" p6:id="R18610199ce5b4e8e"/>
               </a:graphicData>
             </a:graphic>
           </wp:inline>
@@ -498,8 +728,16 @@
     <w:p>
       <w:pPr>
         <w:pStyle w:val="Heading1"/>
+        <w:keepNext/>
+        <w:spacing w:before="200" w:after="160"/>
       </w:pPr>
       <w:r>
+        <w:rPr>
+          <w:b/>
+          <w:bCs/>
+          <w:color w:val="17365D"/>
+          <w:sz w:val="30"/>
+        </w:rPr>
         <w:t xml:space="preserve">Next steps</w:t>
       </w:r>
     </w:p>
@@ -528,8 +766,8 @@
       </w:r>
     </w:p>
     <w:sectPr>
-      <w:headerReference w:type="default" r:id="R3a65411fc8264636"/>
-      <w:footerReference w:type="default" r:id="R49e4cfc7e64048a8"/>
+      <w:headerReference w:type="default" r:id="Rb58ebe14dc70446e"/>
+      <w:footerReference w:type="default" r:id="R191bbcb2e8594043"/>
       <w:pgSz w:w="12240" w:h="15840" w:code="1"/>
       <w:pgMar w:top="1440" w:right="1440" w:bottom="1440" w:left="1440" w:header="720" w:footer="720" w:gutter="0"/>
     </w:sectPr>
@@ -607,7 +845,7 @@
 <file path=word/numbering.xml><?xml version="1.0" encoding="utf-8"?>
 <w:numbering xmlns:wpc="http://schemas.microsoft.com/office/word/2010/wordprocessingCanvas" xmlns:cx="http://schemas.microsoft.com/office/drawing/2014/chartex" xmlns:cx1="http://schemas.microsoft.com/office/drawing/2015/9/8/chartex" xmlns:cx2="http://schemas.microsoft.com/office/drawing/2015/10/21/chartex" xmlns:cx3="http://schemas.microsoft.com/office/drawing/2016/5/9/chartex" xmlns:cx4="http://schemas.microsoft.com/office/drawing/2016/5/10/chartex" xmlns:cx5="http://schemas.microsoft.com/office/drawing/2016/5/11/chartex" xmlns:cx6="http://schemas.microsoft.com/office/drawing/2016/5/12/chartex" xmlns:cx7="http://schemas.microsoft.com/office/drawing/2016/5/13/chartex" xmlns:cx8="http://schemas.microsoft.com/office/drawing/2016/5/14/chartex" xmlns:mc="http://schemas.openxmlformats.org/markup-compatibility/2006" xmlns:aink="http://schemas.microsoft.com/office/drawing/2016/ink" xmlns:am3d="http://schemas.microsoft.com/office/drawing/2017/model3d" xmlns:o="urn:schemas-microsoft-com:office:office" xmlns:oel="http://schemas.microsoft.com/office/2019/extlst" xmlns:r="http://schemas.openxmlformats.org/officeDocument/2006/relationships" xmlns:m="http://schemas.openxmlformats.org/officeDocument/2006/math" xmlns:v="urn:schemas-microsoft-com:vml" xmlns:wp14="http://schemas.microsoft.com/office/word/2010/wordprocessingDrawing" xmlns:wp="http://schemas.openxmlformats.org/drawingml/2006/wordprocessingDrawing" xmlns:w10="urn:schemas-microsoft-com:office:word" xmlns:w="http://schemas.openxmlformats.org/wordprocessingml/2006/main" xmlns:w14="http://schemas.microsoft.com/office/word/2010/wordml" xmlns:w15="http://schemas.microsoft.com/office/word/2012/wordml" xmlns:w16cex="http://schemas.microsoft.com/office/word/2018/wordml/cex" xmlns:w16cid="http://schemas.microsoft.com/office/word/2016/wordml/cid" xmlns:w16="http://schemas.microsoft.com/office/word/2018/wordml" xmlns:w16sdtdh="http://schemas.microsoft.com/office/word/2020/wordml/sdtdatahash" xmlns:w16se="http://schemas.microsoft.com/office/word/2015/wordml/symex" xmlns:wpg="http://schemas.microsoft.com/office/word/2010/wordprocessingGroup" xmlns:wpi="http://schemas.microsoft.com/office/word/2010/wordprocessingInk" xmlns:wne="http://schemas.microsoft.com/office/word/2006/wordml" xmlns:wps="http://schemas.microsoft.com/office/word/2010/wordprocessingShape" mc:Ignorable="w14 w15 w16se w16cid w16 w16cex w16sdtdh wp14">
   <w:abstractNum w:abstractNumId="0" w15:restartNumberingAfterBreak="0">
-    <w:nsid w:val="3A15DF4D"/>
+    <w:nsid w:val="E9CA4B33"/>
     <w:multiLevelType w:val="hybridMultilevel"/>
     <w:tmpl w:val="25BE4216"/>
     <w:lvl w:ilvl="0" w:tplc="0409000F">

</xml_diff>

<commit_message>
Refresh PowerShell documentation from the public 3.0.8 package
</commit_message>
<xml_diff>
--- a/Website/static/downloads/showcase/pswriteoffice/patch-compliance-report.docx
+++ b/Website/static/downloads/showcase/pswriteoffice/patch-compliance-report.docx
@@ -718,7 +718,7 @@
             <wp:docPr id="1" name="chart"/>
             <a:graphic xmlns:a="http://schemas.openxmlformats.org/drawingml/2006/main">
               <a:graphicData uri="http://schemas.openxmlformats.org/drawingml/2006/chart">
-                <c:chart xmlns:p6="http://schemas.openxmlformats.org/officeDocument/2006/relationships" xmlns:c="http://schemas.openxmlformats.org/drawingml/2006/chart" p6:id="R18610199ce5b4e8e"/>
+                <c:chart xmlns:p6="http://schemas.openxmlformats.org/officeDocument/2006/relationships" xmlns:c="http://schemas.openxmlformats.org/drawingml/2006/chart" p6:id="R46315afe347642f5"/>
               </a:graphicData>
             </a:graphic>
           </wp:inline>
@@ -766,8 +766,8 @@
       </w:r>
     </w:p>
     <w:sectPr>
-      <w:headerReference w:type="default" r:id="Rb58ebe14dc70446e"/>
-      <w:footerReference w:type="default" r:id="R191bbcb2e8594043"/>
+      <w:headerReference w:type="default" r:id="R042b2f78e28e4948"/>
+      <w:footerReference w:type="default" r:id="R7e9e53f1c0d04fbf"/>
       <w:pgSz w:w="12240" w:h="15840" w:code="1"/>
       <w:pgMar w:top="1440" w:right="1440" w:bottom="1440" w:left="1440" w:header="720" w:footer="720" w:gutter="0"/>
     </w:sectPr>
@@ -845,7 +845,7 @@
 <file path=word/numbering.xml><?xml version="1.0" encoding="utf-8"?>
 <w:numbering xmlns:wpc="http://schemas.microsoft.com/office/word/2010/wordprocessingCanvas" xmlns:cx="http://schemas.microsoft.com/office/drawing/2014/chartex" xmlns:cx1="http://schemas.microsoft.com/office/drawing/2015/9/8/chartex" xmlns:cx2="http://schemas.microsoft.com/office/drawing/2015/10/21/chartex" xmlns:cx3="http://schemas.microsoft.com/office/drawing/2016/5/9/chartex" xmlns:cx4="http://schemas.microsoft.com/office/drawing/2016/5/10/chartex" xmlns:cx5="http://schemas.microsoft.com/office/drawing/2016/5/11/chartex" xmlns:cx6="http://schemas.microsoft.com/office/drawing/2016/5/12/chartex" xmlns:cx7="http://schemas.microsoft.com/office/drawing/2016/5/13/chartex" xmlns:cx8="http://schemas.microsoft.com/office/drawing/2016/5/14/chartex" xmlns:mc="http://schemas.openxmlformats.org/markup-compatibility/2006" xmlns:aink="http://schemas.microsoft.com/office/drawing/2016/ink" xmlns:am3d="http://schemas.microsoft.com/office/drawing/2017/model3d" xmlns:o="urn:schemas-microsoft-com:office:office" xmlns:oel="http://schemas.microsoft.com/office/2019/extlst" xmlns:r="http://schemas.openxmlformats.org/officeDocument/2006/relationships" xmlns:m="http://schemas.openxmlformats.org/officeDocument/2006/math" xmlns:v="urn:schemas-microsoft-com:vml" xmlns:wp14="http://schemas.microsoft.com/office/word/2010/wordprocessingDrawing" xmlns:wp="http://schemas.openxmlformats.org/drawingml/2006/wordprocessingDrawing" xmlns:w10="urn:schemas-microsoft-com:office:word" xmlns:w="http://schemas.openxmlformats.org/wordprocessingml/2006/main" xmlns:w14="http://schemas.microsoft.com/office/word/2010/wordml" xmlns:w15="http://schemas.microsoft.com/office/word/2012/wordml" xmlns:w16cex="http://schemas.microsoft.com/office/word/2018/wordml/cex" xmlns:w16cid="http://schemas.microsoft.com/office/word/2016/wordml/cid" xmlns:w16="http://schemas.microsoft.com/office/word/2018/wordml" xmlns:w16sdtdh="http://schemas.microsoft.com/office/word/2020/wordml/sdtdatahash" xmlns:w16se="http://schemas.microsoft.com/office/word/2015/wordml/symex" xmlns:wpg="http://schemas.microsoft.com/office/word/2010/wordprocessingGroup" xmlns:wpi="http://schemas.microsoft.com/office/word/2010/wordprocessingInk" xmlns:wne="http://schemas.microsoft.com/office/word/2006/wordml" xmlns:wps="http://schemas.microsoft.com/office/word/2010/wordprocessingShape" mc:Ignorable="w14 w15 w16se w16cid w16 w16cex w16sdtdh wp14">
   <w:abstractNum w:abstractNumId="0" w15:restartNumberingAfterBreak="0">
-    <w:nsid w:val="E9CA4B33"/>
+    <w:nsid w:val="63E81669"/>
     <w:multiLevelType w:val="hybridMultilevel"/>
     <w:tmpl w:val="25BE4216"/>
     <w:lvl w:ilvl="0" w:tplc="0409000F">

</xml_diff>